<commit_message>
Refresh Ferrion logo with new metallic F-mark (site + documents)
Extract the two new AI-rendered logo images into a transparent
dark-background asset (public/logos/ferrion-full.webp) and swap it in
across all 12 site placements (header, footer, login, dashboard,
legal pages, structured data).

For the DOCX/PPTX document templates (white background), recolor the
wordmark to dark ink so it stays legible on paper while keeping the
metallic F-mark. Regenerate all 9 Word templates and both PowerPoint
masters with the new asset and its corrected aspect ratio.

Raw AI source renders moved to gitignored obsolete/ for reference.

Co-Authored-By: Claude Sonnet 5 <noreply@anthropic.com>
</commit_message>
<xml_diff>
--- a/templates/Ferrion-Abnahmeprotokoll-Vorlage.docx
+++ b/templates/Ferrion-Abnahmeprotokoll-Vorlage.docx
@@ -40,7 +40,7 @@
             <w:r>
               <w:drawing>
                 <wp:inline distT="0" distB="0" distL="0" distR="0">
-                  <wp:extent cx="1676400" cy="419100"/>
+                  <wp:extent cx="1000125" cy="533400"/>
                   <wp:effectExtent t="0" r="0" b="0" l="0"/>
                   <wp:docPr id="1" name="" descr="" title=""/>
                   <wp:cNvGraphicFramePr>
@@ -65,7 +65,7 @@
                         <pic:spPr bwMode="auto">
                           <a:xfrm>
                             <a:off x="0" y="0"/>
-                            <a:ext cx="1676400" cy="419100"/>
+                            <a:ext cx="1000125" cy="533400"/>
                           </a:xfrm>
                           <a:prstGeom prst="rect">
                             <a:avLst/>

</xml_diff>